<commit_message>
Sync local project state
</commit_message>
<xml_diff>
--- a/Dokumentasi UKK Paket 1_Ridwan_Ramdani_SMK Muhammadiyah 2 Cibiru-2.docx
+++ b/Dokumentasi UKK Paket 1_Ridwan_Ramdani_SMK Muhammadiyah 2 Cibiru-2.docx
@@ -1,6 +1,6 @@
 
 <file path=word/document.xml><?xml version="1.0" encoding="utf-8"?>
-<w:document xmlns:wpc="http://schemas.microsoft.com/office/word/2010/wordprocessingCanvas" xmlns:cx="http://schemas.microsoft.com/office/drawing/2014/chartex" xmlns:cx1="http://schemas.microsoft.com/office/drawing/2015/9/8/chartex" xmlns:cx2="http://schemas.microsoft.com/office/drawing/2015/10/21/chartex" xmlns:cx3="http://schemas.microsoft.com/office/drawing/2016/5/9/chartex" xmlns:cx4="http://schemas.microsoft.com/office/drawing/2016/5/10/chartex" xmlns:cx5="http://schemas.microsoft.com/office/drawing/2016/5/11/chartex" xmlns:cx6="http://schemas.microsoft.com/office/drawing/2016/5/12/chartex" xmlns:cx7="http://schemas.microsoft.com/office/drawing/2016/5/13/chartex" xmlns:cx8="http://schemas.microsoft.com/office/drawing/2016/5/14/chartex" xmlns:mc="http://schemas.openxmlformats.org/markup-compatibility/2006" xmlns:aink="http://schemas.microsoft.com/office/drawing/2016/ink" xmlns:am3d="http://schemas.microsoft.com/office/drawing/2017/model3d" xmlns:o="urn:schemas-microsoft-com:office:office" xmlns:oel="http://schemas.microsoft.com/office/2019/extlst" xmlns:r="http://schemas.openxmlformats.org/officeDocument/2006/relationships" xmlns:m="http://schemas.openxmlformats.org/officeDocument/2006/math" xmlns:v="urn:schemas-microsoft-com:vml" xmlns:wp14="http://schemas.microsoft.com/office/word/2010/wordprocessingDrawing" xmlns:wp="http://schemas.openxmlformats.org/drawingml/2006/wordprocessingDrawing" xmlns:w10="urn:schemas-microsoft-com:office:word" xmlns:w="http://schemas.openxmlformats.org/wordprocessingml/2006/main" xmlns:w14="http://schemas.microsoft.com/office/word/2010/wordml" xmlns:w15="http://schemas.microsoft.com/office/word/2012/wordml" xmlns:w16cex="http://schemas.microsoft.com/office/word/2018/wordml/cex" xmlns:w16cid="http://schemas.microsoft.com/office/word/2016/wordml/cid" xmlns:w16="http://schemas.microsoft.com/office/word/2018/wordml" xmlns:w16du="http://schemas.microsoft.com/office/word/2023/wordml/word16du" xmlns:w16sdtdh="http://schemas.microsoft.com/office/word/2020/wordml/sdtdatahash" xmlns:w16sdtfl="http://schemas.microsoft.com/office/word/2024/wordml/sdtformatlock" xmlns:w16se="http://schemas.microsoft.com/office/word/2015/wordml/symex" xmlns:wpg="http://schemas.microsoft.com/office/word/2010/wordprocessingGroup" xmlns:wpi="http://schemas.microsoft.com/office/word/2010/wordprocessingInk" xmlns:wne="http://schemas.microsoft.com/office/word/2006/wordml" xmlns:wps="http://schemas.microsoft.com/office/word/2010/wordprocessingShape" mc:Ignorable="w14 w15 w16se w16cid w16 w16cex w16sdtdh w16sdtfl w16du wp14">
+<w:document xmlns:a="http://schemas.openxmlformats.org/drawingml/2006/main" xmlns:pic="http://schemas.openxmlformats.org/drawingml/2006/picture" xmlns:a14="http://schemas.microsoft.com/office/drawing/2010/main" xmlns:wpc="http://schemas.microsoft.com/office/word/2010/wordprocessingCanvas" xmlns:cx="http://schemas.microsoft.com/office/drawing/2014/chartex" xmlns:cx1="http://schemas.microsoft.com/office/drawing/2015/9/8/chartex" xmlns:cx2="http://schemas.microsoft.com/office/drawing/2015/10/21/chartex" xmlns:cx3="http://schemas.microsoft.com/office/drawing/2016/5/9/chartex" xmlns:cx4="http://schemas.microsoft.com/office/drawing/2016/5/10/chartex" xmlns:cx5="http://schemas.microsoft.com/office/drawing/2016/5/11/chartex" xmlns:cx6="http://schemas.microsoft.com/office/drawing/2016/5/12/chartex" xmlns:cx7="http://schemas.microsoft.com/office/drawing/2016/5/13/chartex" xmlns:cx8="http://schemas.microsoft.com/office/drawing/2016/5/14/chartex" xmlns:mc="http://schemas.openxmlformats.org/markup-compatibility/2006" xmlns:aink="http://schemas.microsoft.com/office/drawing/2016/ink" xmlns:am3d="http://schemas.microsoft.com/office/drawing/2017/model3d" xmlns:o="urn:schemas-microsoft-com:office:office" xmlns:oel="http://schemas.microsoft.com/office/2019/extlst" xmlns:r="http://schemas.openxmlformats.org/officeDocument/2006/relationships" xmlns:m="http://schemas.openxmlformats.org/officeDocument/2006/math" xmlns:v="urn:schemas-microsoft-com:vml" xmlns:wp14="http://schemas.microsoft.com/office/word/2010/wordprocessingDrawing" xmlns:wp="http://schemas.openxmlformats.org/drawingml/2006/wordprocessingDrawing" xmlns:w10="urn:schemas-microsoft-com:office:word" xmlns:w="http://schemas.openxmlformats.org/wordprocessingml/2006/main" xmlns:w14="http://schemas.microsoft.com/office/word/2010/wordml" xmlns:w15="http://schemas.microsoft.com/office/word/2012/wordml" xmlns:w16cex="http://schemas.microsoft.com/office/word/2018/wordml/cex" xmlns:w16cid="http://schemas.microsoft.com/office/word/2016/wordml/cid" xmlns:w16="http://schemas.microsoft.com/office/word/2018/wordml" xmlns:w16du="http://schemas.microsoft.com/office/word/2023/wordml/word16du" xmlns:w16sdtdh="http://schemas.microsoft.com/office/word/2020/wordml/sdtdatahash" xmlns:w16sdtfl="http://schemas.microsoft.com/office/word/2024/wordml/sdtformatlock" xmlns:w16se="http://schemas.microsoft.com/office/word/2015/wordml/symex" xmlns:wpg="http://schemas.microsoft.com/office/word/2010/wordprocessingGroup" xmlns:wpi="http://schemas.microsoft.com/office/word/2010/wordprocessingInk" xmlns:wne="http://schemas.microsoft.com/office/word/2006/wordml" xmlns:wps="http://schemas.microsoft.com/office/word/2010/wordprocessingShape" mc:Ignorable="w14 w15 w16se w16cid w16 w16cex w16sdtdh w16sdtfl w16du wp14">
   <w:body>
     <w:p>
       <w:pPr>
@@ -8117,7 +8117,7 @@
         </w:tabs>
         <w:spacing w:after="100" w:afterAutospacing="1" w:line="276" w:lineRule="auto"/>
         <w:rPr>
-          <w:rFonts w:ascii="Times New Roman" w:eastAsia="Times New Roman" w:hAnsi="Times New Roman" w:cs="Times New Roman"/>
+          <w:rFonts w:ascii="Times New Roman" w:hAnsi="Times New Roman" w:eastAsia="Times New Roman" w:cs="Times New Roman"/>
           <w:sz w:val="24"/>
           <w:szCs w:val="24"/>
           <w:lang w:eastAsia="en-ID"/>
@@ -8125,7 +8125,7 @@
       </w:pPr>
       <w:r>
         <w:rPr>
-          <w:rFonts w:ascii="Times New Roman" w:eastAsia="Times New Roman" w:hAnsi="Times New Roman" w:cs="Times New Roman"/>
+          <w:rFonts w:ascii="Times New Roman" w:hAnsi="Times New Roman" w:eastAsia="Times New Roman" w:cs="Times New Roman"/>
           <w:b/>
           <w:bCs/>
           <w:sz w:val="24"/>
@@ -8163,7 +8163,7 @@
               <w:spacing w:after="100" w:afterAutospacing="1" w:line="276" w:lineRule="auto"/>
               <w:jc w:val="center"/>
               <w:rPr>
-                <w:rFonts w:ascii="Times New Roman" w:eastAsia="Times New Roman" w:hAnsi="Times New Roman" w:cs="Times New Roman"/>
+                <w:rFonts w:ascii="Times New Roman" w:hAnsi="Times New Roman" w:eastAsia="Times New Roman" w:cs="Times New Roman"/>
                 <w:sz w:val="24"/>
                 <w:szCs w:val="24"/>
                 <w:lang w:eastAsia="en-ID"/>
@@ -8171,7 +8171,7 @@
             </w:pPr>
             <w:r>
               <w:rPr>
-                <w:rFonts w:ascii="Times New Roman" w:eastAsia="Times New Roman" w:hAnsi="Times New Roman" w:cs="Times New Roman"/>
+                <w:rFonts w:ascii="Times New Roman" w:hAnsi="Times New Roman" w:eastAsia="Times New Roman" w:cs="Times New Roman"/>
                 <w:noProof/>
                 <w:sz w:val="24"/>
                 <w:szCs w:val="24"/>
@@ -8241,7 +8241,7 @@
               <w:spacing w:after="100" w:afterAutospacing="1" w:line="276" w:lineRule="auto"/>
               <w:jc w:val="center"/>
               <w:rPr>
-                <w:rFonts w:ascii="Times New Roman" w:eastAsia="Times New Roman" w:hAnsi="Times New Roman" w:cs="Times New Roman"/>
+                <w:rFonts w:ascii="Times New Roman" w:hAnsi="Times New Roman" w:eastAsia="Times New Roman" w:cs="Times New Roman"/>
                 <w:b/>
                 <w:bCs/>
                 <w:sz w:val="24"/>
@@ -8251,7 +8251,7 @@
             </w:pPr>
             <w:r>
               <w:rPr>
-                <w:rFonts w:ascii="Times New Roman" w:eastAsia="Times New Roman" w:hAnsi="Times New Roman" w:cs="Times New Roman"/>
+                <w:rFonts w:ascii="Times New Roman" w:hAnsi="Times New Roman" w:eastAsia="Times New Roman" w:cs="Times New Roman"/>
                 <w:b/>
                 <w:bCs/>
                 <w:sz w:val="24"/>
@@ -8272,7 +8272,7 @@
         <w:spacing w:after="100" w:afterAutospacing="1" w:line="276" w:lineRule="auto"/>
         <w:jc w:val="center"/>
         <w:rPr>
-          <w:rFonts w:ascii="Times New Roman" w:eastAsia="Times New Roman" w:hAnsi="Times New Roman" w:cs="Times New Roman"/>
+          <w:rFonts w:ascii="Times New Roman" w:hAnsi="Times New Roman" w:eastAsia="Times New Roman" w:cs="Times New Roman"/>
           <w:sz w:val="24"/>
           <w:szCs w:val="24"/>
           <w:lang w:eastAsia="en-ID"/>
@@ -8291,7 +8291,7 @@
         </w:tabs>
         <w:spacing w:before="100" w:beforeAutospacing="1" w:after="100" w:afterAutospacing="1" w:line="276" w:lineRule="auto"/>
         <w:rPr>
-          <w:rFonts w:ascii="Times New Roman" w:eastAsia="Times New Roman" w:hAnsi="Times New Roman" w:cs="Times New Roman"/>
+          <w:rFonts w:ascii="Times New Roman" w:hAnsi="Times New Roman" w:eastAsia="Times New Roman" w:cs="Times New Roman"/>
           <w:sz w:val="24"/>
           <w:szCs w:val="24"/>
           <w:lang w:eastAsia="en-ID"/>
@@ -8299,7 +8299,7 @@
       </w:pPr>
       <w:r>
         <w:rPr>
-          <w:rFonts w:ascii="Times New Roman" w:eastAsia="Times New Roman" w:hAnsi="Times New Roman" w:cs="Times New Roman"/>
+          <w:rFonts w:ascii="Times New Roman" w:hAnsi="Times New Roman" w:eastAsia="Times New Roman" w:cs="Times New Roman"/>
           <w:b/>
           <w:bCs/>
           <w:sz w:val="24"/>
@@ -8311,7 +8311,7 @@
       <w:proofErr w:type="spellStart"/>
       <w:r>
         <w:rPr>
-          <w:rFonts w:ascii="Times New Roman" w:eastAsia="Times New Roman" w:hAnsi="Times New Roman" w:cs="Times New Roman"/>
+          <w:rFonts w:ascii="Times New Roman" w:hAnsi="Times New Roman" w:eastAsia="Times New Roman" w:cs="Times New Roman"/>
           <w:b/>
           <w:bCs/>
           <w:sz w:val="24"/>
@@ -8323,7 +8323,7 @@
       <w:proofErr w:type="spellEnd"/>
       <w:r>
         <w:rPr>
-          <w:rFonts w:ascii="Times New Roman" w:eastAsia="Times New Roman" w:hAnsi="Times New Roman" w:cs="Times New Roman"/>
+          <w:rFonts w:ascii="Times New Roman" w:hAnsi="Times New Roman" w:eastAsia="Times New Roman" w:cs="Times New Roman"/>
           <w:sz w:val="24"/>
           <w:szCs w:val="24"/>
           <w:lang w:eastAsia="en-ID"/>
@@ -8333,7 +8333,7 @@
       <w:proofErr w:type="spellStart"/>
       <w:r>
         <w:rPr>
-          <w:rFonts w:ascii="Times New Roman" w:eastAsia="Times New Roman" w:hAnsi="Times New Roman" w:cs="Times New Roman"/>
+          <w:rFonts w:ascii="Times New Roman" w:hAnsi="Times New Roman" w:eastAsia="Times New Roman" w:cs="Times New Roman"/>
           <w:sz w:val="24"/>
           <w:szCs w:val="24"/>
           <w:lang w:eastAsia="en-ID"/>
@@ -8343,7 +8343,7 @@
       <w:proofErr w:type="spellEnd"/>
       <w:r>
         <w:rPr>
-          <w:rFonts w:ascii="Times New Roman" w:eastAsia="Times New Roman" w:hAnsi="Times New Roman" w:cs="Times New Roman"/>
+          <w:rFonts w:ascii="Times New Roman" w:hAnsi="Times New Roman" w:eastAsia="Times New Roman" w:cs="Times New Roman"/>
           <w:sz w:val="24"/>
           <w:szCs w:val="24"/>
           <w:lang w:eastAsia="en-ID"/>
@@ -8353,7 +8353,7 @@
       <w:proofErr w:type="spellStart"/>
       <w:r>
         <w:rPr>
-          <w:rFonts w:ascii="Times New Roman" w:eastAsia="Times New Roman" w:hAnsi="Times New Roman" w:cs="Times New Roman"/>
+          <w:rFonts w:ascii="Times New Roman" w:hAnsi="Times New Roman" w:eastAsia="Times New Roman" w:cs="Times New Roman"/>
           <w:sz w:val="24"/>
           <w:szCs w:val="24"/>
           <w:lang w:eastAsia="en-ID"/>
@@ -8363,7 +8363,7 @@
       <w:proofErr w:type="spellEnd"/>
       <w:r>
         <w:rPr>
-          <w:rFonts w:ascii="Times New Roman" w:eastAsia="Times New Roman" w:hAnsi="Times New Roman" w:cs="Times New Roman"/>
+          <w:rFonts w:ascii="Times New Roman" w:hAnsi="Times New Roman" w:eastAsia="Times New Roman" w:cs="Times New Roman"/>
           <w:sz w:val="24"/>
           <w:szCs w:val="24"/>
           <w:lang w:eastAsia="en-ID"/>
@@ -8376,12 +8376,12 @@
         <w:tblStyle w:val="TableGrid"/>
         <w:tblW w:w="0" w:type="auto"/>
         <w:tblBorders>
-          <w:top w:val="none" w:sz="0" w:space="0" w:color="auto"/>
-          <w:left w:val="none" w:sz="0" w:space="0" w:color="auto"/>
-          <w:bottom w:val="none" w:sz="0" w:space="0" w:color="auto"/>
-          <w:right w:val="none" w:sz="0" w:space="0" w:color="auto"/>
-          <w:insideH w:val="none" w:sz="0" w:space="0" w:color="auto"/>
-          <w:insideV w:val="none" w:sz="0" w:space="0" w:color="auto"/>
+          <w:top w:val="none" w:color="auto" w:sz="0" w:space="0"/>
+          <w:left w:val="none" w:color="auto" w:sz="0" w:space="0"/>
+          <w:bottom w:val="none" w:color="auto" w:sz="0" w:space="0"/>
+          <w:right w:val="none" w:color="auto" w:sz="0" w:space="0"/>
+          <w:insideH w:val="none" w:color="auto" w:sz="0" w:space="0"/>
+          <w:insideV w:val="none" w:color="auto" w:sz="0" w:space="0"/>
         </w:tblBorders>
         <w:tblLook w:val="04A0" w:firstRow="1" w:lastRow="0" w:firstColumn="1" w:lastColumn="0" w:noHBand="0" w:noVBand="1"/>
       </w:tblPr>
@@ -8401,7 +8401,7 @@
               <w:spacing w:before="100" w:beforeAutospacing="1" w:after="100" w:afterAutospacing="1" w:line="276" w:lineRule="auto"/>
               <w:jc w:val="center"/>
               <w:rPr>
-                <w:rFonts w:ascii="Times New Roman" w:eastAsia="Times New Roman" w:hAnsi="Times New Roman" w:cs="Times New Roman"/>
+                <w:rFonts w:ascii="Times New Roman" w:hAnsi="Times New Roman" w:eastAsia="Times New Roman" w:cs="Times New Roman"/>
                 <w:sz w:val="24"/>
                 <w:szCs w:val="24"/>
                 <w:lang w:eastAsia="en-ID"/>
@@ -8409,7 +8409,7 @@
             </w:pPr>
             <w:r>
               <w:rPr>
-                <w:rFonts w:ascii="Times New Roman" w:eastAsia="Times New Roman" w:hAnsi="Times New Roman" w:cs="Times New Roman"/>
+                <w:rFonts w:ascii="Times New Roman" w:hAnsi="Times New Roman" w:eastAsia="Times New Roman" w:cs="Times New Roman"/>
                 <w:noProof/>
                 <w:sz w:val="24"/>
                 <w:szCs w:val="24"/>
@@ -8473,7 +8473,7 @@
               <w:spacing w:before="100" w:beforeAutospacing="1" w:after="100" w:afterAutospacing="1" w:line="276" w:lineRule="auto"/>
               <w:jc w:val="center"/>
               <w:rPr>
-                <w:rFonts w:ascii="Times New Roman" w:eastAsia="Times New Roman" w:hAnsi="Times New Roman" w:cs="Times New Roman"/>
+                <w:rFonts w:ascii="Times New Roman" w:hAnsi="Times New Roman" w:eastAsia="Times New Roman" w:cs="Times New Roman"/>
                 <w:b/>
                 <w:bCs/>
                 <w:sz w:val="24"/>
@@ -8483,7 +8483,7 @@
             </w:pPr>
             <w:r>
               <w:rPr>
-                <w:rFonts w:ascii="Times New Roman" w:eastAsia="Times New Roman" w:hAnsi="Times New Roman" w:cs="Times New Roman"/>
+                <w:rFonts w:ascii="Times New Roman" w:hAnsi="Times New Roman" w:eastAsia="Times New Roman" w:cs="Times New Roman"/>
                 <w:b/>
                 <w:bCs/>
                 <w:sz w:val="24"/>
@@ -8495,7 +8495,7 @@
             <w:proofErr w:type="spellStart"/>
             <w:r>
               <w:rPr>
-                <w:rFonts w:ascii="Times New Roman" w:eastAsia="Times New Roman" w:hAnsi="Times New Roman" w:cs="Times New Roman"/>
+                <w:rFonts w:ascii="Times New Roman" w:hAnsi="Times New Roman" w:eastAsia="Times New Roman" w:cs="Times New Roman"/>
                 <w:b/>
                 <w:bCs/>
                 <w:sz w:val="24"/>
@@ -8507,7 +8507,7 @@
             <w:proofErr w:type="spellEnd"/>
             <w:r>
               <w:rPr>
-                <w:rFonts w:ascii="Times New Roman" w:eastAsia="Times New Roman" w:hAnsi="Times New Roman" w:cs="Times New Roman"/>
+                <w:rFonts w:ascii="Times New Roman" w:hAnsi="Times New Roman" w:eastAsia="Times New Roman" w:cs="Times New Roman"/>
                 <w:b/>
                 <w:bCs/>
                 <w:sz w:val="24"/>
@@ -8527,7 +8527,7 @@
         </w:tabs>
         <w:spacing w:before="100" w:beforeAutospacing="1" w:after="100" w:afterAutospacing="1" w:line="276" w:lineRule="auto"/>
         <w:rPr>
-          <w:rFonts w:ascii="Times New Roman" w:eastAsia="Times New Roman" w:hAnsi="Times New Roman" w:cs="Times New Roman"/>
+          <w:rFonts w:ascii="Times New Roman" w:hAnsi="Times New Roman" w:eastAsia="Times New Roman" w:cs="Times New Roman"/>
           <w:sz w:val="24"/>
           <w:szCs w:val="24"/>
           <w:lang w:eastAsia="en-ID"/>
@@ -8546,7 +8546,7 @@
         </w:tabs>
         <w:spacing w:after="0" w:line="276" w:lineRule="auto"/>
         <w:rPr>
-          <w:rFonts w:ascii="Times New Roman" w:eastAsia="Times New Roman" w:hAnsi="Times New Roman" w:cs="Times New Roman"/>
+          <w:rFonts w:ascii="Times New Roman" w:hAnsi="Times New Roman" w:eastAsia="Times New Roman" w:cs="Times New Roman"/>
           <w:sz w:val="24"/>
           <w:szCs w:val="24"/>
           <w:lang w:eastAsia="en-ID"/>
@@ -8554,7 +8554,7 @@
       </w:pPr>
       <w:r>
         <w:rPr>
-          <w:rFonts w:ascii="Times New Roman" w:eastAsia="Times New Roman" w:hAnsi="Times New Roman" w:cs="Times New Roman"/>
+          <w:rFonts w:ascii="Times New Roman" w:hAnsi="Times New Roman" w:eastAsia="Times New Roman" w:cs="Times New Roman"/>
           <w:b/>
           <w:bCs/>
           <w:sz w:val="24"/>
@@ -8566,7 +8566,7 @@
       <w:proofErr w:type="spellStart"/>
       <w:r>
         <w:rPr>
-          <w:rFonts w:ascii="Times New Roman" w:eastAsia="Times New Roman" w:hAnsi="Times New Roman" w:cs="Times New Roman"/>
+          <w:rFonts w:ascii="Times New Roman" w:hAnsi="Times New Roman" w:eastAsia="Times New Roman" w:cs="Times New Roman"/>
           <w:b/>
           <w:bCs/>
           <w:sz w:val="24"/>
@@ -8578,7 +8578,7 @@
       <w:proofErr w:type="spellEnd"/>
       <w:r>
         <w:rPr>
-          <w:rFonts w:ascii="Times New Roman" w:eastAsia="Times New Roman" w:hAnsi="Times New Roman" w:cs="Times New Roman"/>
+          <w:rFonts w:ascii="Times New Roman" w:hAnsi="Times New Roman" w:eastAsia="Times New Roman" w:cs="Times New Roman"/>
           <w:b/>
           <w:bCs/>
           <w:sz w:val="24"/>
@@ -8590,7 +8590,7 @@
       <w:proofErr w:type="spellStart"/>
       <w:r>
         <w:rPr>
-          <w:rFonts w:ascii="Times New Roman" w:eastAsia="Times New Roman" w:hAnsi="Times New Roman" w:cs="Times New Roman"/>
+          <w:rFonts w:ascii="Times New Roman" w:hAnsi="Times New Roman" w:eastAsia="Times New Roman" w:cs="Times New Roman"/>
           <w:b/>
           <w:bCs/>
           <w:sz w:val="24"/>
@@ -8602,7 +8602,7 @@
       <w:proofErr w:type="spellEnd"/>
       <w:r>
         <w:rPr>
-          <w:rFonts w:ascii="Times New Roman" w:eastAsia="Times New Roman" w:hAnsi="Times New Roman" w:cs="Times New Roman"/>
+          <w:rFonts w:ascii="Times New Roman" w:hAnsi="Times New Roman" w:eastAsia="Times New Roman" w:cs="Times New Roman"/>
           <w:b/>
           <w:bCs/>
           <w:sz w:val="24"/>
@@ -8617,12 +8617,12 @@
         <w:tblStyle w:val="TableGrid"/>
         <w:tblW w:w="0" w:type="auto"/>
         <w:tblBorders>
-          <w:top w:val="none" w:sz="0" w:space="0" w:color="auto"/>
-          <w:left w:val="none" w:sz="0" w:space="0" w:color="auto"/>
-          <w:bottom w:val="none" w:sz="0" w:space="0" w:color="auto"/>
-          <w:right w:val="none" w:sz="0" w:space="0" w:color="auto"/>
-          <w:insideH w:val="none" w:sz="0" w:space="0" w:color="auto"/>
-          <w:insideV w:val="none" w:sz="0" w:space="0" w:color="auto"/>
+          <w:top w:val="none" w:color="auto" w:sz="0" w:space="0"/>
+          <w:left w:val="none" w:color="auto" w:sz="0" w:space="0"/>
+          <w:bottom w:val="none" w:color="auto" w:sz="0" w:space="0"/>
+          <w:right w:val="none" w:color="auto" w:sz="0" w:space="0"/>
+          <w:insideH w:val="none" w:color="auto" w:sz="0" w:space="0"/>
+          <w:insideV w:val="none" w:color="auto" w:sz="0" w:space="0"/>
         </w:tblBorders>
         <w:tblLook w:val="04A0" w:firstRow="1" w:lastRow="0" w:firstColumn="1" w:lastColumn="0" w:noHBand="0" w:noVBand="1"/>
       </w:tblPr>
@@ -8642,7 +8642,7 @@
               <w:spacing w:line="276" w:lineRule="auto"/>
               <w:jc w:val="center"/>
               <w:rPr>
-                <w:rFonts w:ascii="Times New Roman" w:eastAsia="Times New Roman" w:hAnsi="Times New Roman" w:cs="Times New Roman"/>
+                <w:rFonts w:ascii="Times New Roman" w:hAnsi="Times New Roman" w:eastAsia="Times New Roman" w:cs="Times New Roman"/>
                 <w:sz w:val="24"/>
                 <w:szCs w:val="24"/>
                 <w:lang w:eastAsia="en-ID"/>
@@ -8650,7 +8650,7 @@
             </w:pPr>
             <w:r>
               <w:rPr>
-                <w:rFonts w:ascii="Times New Roman" w:eastAsia="Times New Roman" w:hAnsi="Times New Roman" w:cs="Times New Roman"/>
+                <w:rFonts w:ascii="Times New Roman" w:hAnsi="Times New Roman" w:eastAsia="Times New Roman" w:cs="Times New Roman"/>
                 <w:noProof/>
                 <w:sz w:val="24"/>
                 <w:szCs w:val="24"/>
@@ -8714,7 +8714,7 @@
               <w:spacing w:line="276" w:lineRule="auto"/>
               <w:jc w:val="center"/>
               <w:rPr>
-                <w:rFonts w:ascii="Times New Roman" w:eastAsia="Times New Roman" w:hAnsi="Times New Roman" w:cs="Times New Roman"/>
+                <w:rFonts w:ascii="Times New Roman" w:hAnsi="Times New Roman" w:eastAsia="Times New Roman" w:cs="Times New Roman"/>
                 <w:sz w:val="24"/>
                 <w:szCs w:val="24"/>
                 <w:lang w:eastAsia="en-ID"/>
@@ -8722,7 +8722,7 @@
             </w:pPr>
             <w:r>
               <w:rPr>
-                <w:rFonts w:ascii="Times New Roman" w:eastAsia="Times New Roman" w:hAnsi="Times New Roman" w:cs="Times New Roman"/>
+                <w:rFonts w:ascii="Times New Roman" w:hAnsi="Times New Roman" w:eastAsia="Times New Roman" w:cs="Times New Roman"/>
                 <w:b/>
                 <w:bCs/>
                 <w:sz w:val="24"/>
@@ -8733,7 +8733,7 @@
             </w:r>
             <w:r>
               <w:rPr>
-                <w:rFonts w:ascii="Times New Roman" w:eastAsia="Times New Roman" w:hAnsi="Times New Roman" w:cs="Times New Roman"/>
+                <w:rFonts w:ascii="Times New Roman" w:hAnsi="Times New Roman" w:eastAsia="Times New Roman" w:cs="Times New Roman"/>
                 <w:b/>
                 <w:bCs/>
                 <w:sz w:val="24"/>
@@ -8744,7 +8744,7 @@
             </w:r>
             <w:r>
               <w:rPr>
-                <w:rFonts w:ascii="Times New Roman" w:eastAsia="Times New Roman" w:hAnsi="Times New Roman" w:cs="Times New Roman"/>
+                <w:rFonts w:ascii="Times New Roman" w:hAnsi="Times New Roman" w:eastAsia="Times New Roman" w:cs="Times New Roman"/>
                 <w:b/>
                 <w:bCs/>
                 <w:sz w:val="24"/>
@@ -8756,7 +8756,7 @@
             <w:proofErr w:type="spellStart"/>
             <w:r>
               <w:rPr>
-                <w:rFonts w:ascii="Times New Roman" w:eastAsia="Times New Roman" w:hAnsi="Times New Roman" w:cs="Times New Roman"/>
+                <w:rFonts w:ascii="Times New Roman" w:hAnsi="Times New Roman" w:eastAsia="Times New Roman" w:cs="Times New Roman"/>
                 <w:b/>
                 <w:bCs/>
                 <w:sz w:val="24"/>
@@ -8767,7 +8767,7 @@
             </w:r>
             <w:r>
               <w:rPr>
-                <w:rFonts w:ascii="Times New Roman" w:eastAsia="Times New Roman" w:hAnsi="Times New Roman" w:cs="Times New Roman"/>
+                <w:rFonts w:ascii="Times New Roman" w:hAnsi="Times New Roman" w:eastAsia="Times New Roman" w:cs="Times New Roman"/>
                 <w:b/>
                 <w:bCs/>
                 <w:sz w:val="24"/>
@@ -8779,7 +8779,7 @@
             <w:proofErr w:type="spellEnd"/>
             <w:r>
               <w:rPr>
-                <w:rFonts w:ascii="Times New Roman" w:eastAsia="Times New Roman" w:hAnsi="Times New Roman" w:cs="Times New Roman"/>
+                <w:rFonts w:ascii="Times New Roman" w:hAnsi="Times New Roman" w:eastAsia="Times New Roman" w:cs="Times New Roman"/>
                 <w:b/>
                 <w:bCs/>
                 <w:sz w:val="24"/>
@@ -8791,7 +8791,7 @@
             <w:proofErr w:type="spellStart"/>
             <w:r>
               <w:rPr>
-                <w:rFonts w:ascii="Times New Roman" w:eastAsia="Times New Roman" w:hAnsi="Times New Roman" w:cs="Times New Roman"/>
+                <w:rFonts w:ascii="Times New Roman" w:hAnsi="Times New Roman" w:eastAsia="Times New Roman" w:cs="Times New Roman"/>
                 <w:b/>
                 <w:bCs/>
                 <w:sz w:val="24"/>
@@ -8803,7 +8803,7 @@
             <w:proofErr w:type="spellEnd"/>
             <w:r>
               <w:rPr>
-                <w:rFonts w:ascii="Times New Roman" w:eastAsia="Times New Roman" w:hAnsi="Times New Roman" w:cs="Times New Roman"/>
+                <w:rFonts w:ascii="Times New Roman" w:hAnsi="Times New Roman" w:eastAsia="Times New Roman" w:cs="Times New Roman"/>
                 <w:b/>
                 <w:bCs/>
                 <w:sz w:val="24"/>
@@ -8824,7 +8824,7 @@
         <w:spacing w:after="0" w:line="276" w:lineRule="auto"/>
         <w:jc w:val="center"/>
         <w:rPr>
-          <w:rFonts w:ascii="Times New Roman" w:eastAsia="Times New Roman" w:hAnsi="Times New Roman" w:cs="Times New Roman"/>
+          <w:rFonts w:ascii="Times New Roman" w:hAnsi="Times New Roman" w:eastAsia="Times New Roman" w:cs="Times New Roman"/>
           <w:sz w:val="24"/>
           <w:szCs w:val="24"/>
           <w:lang w:eastAsia="en-ID"/>
@@ -8839,7 +8839,7 @@
         <w:spacing w:after="0" w:line="276" w:lineRule="auto"/>
         <w:jc w:val="center"/>
         <w:rPr>
-          <w:rFonts w:ascii="Times New Roman" w:eastAsia="Times New Roman" w:hAnsi="Times New Roman" w:cs="Times New Roman"/>
+          <w:rFonts w:ascii="Times New Roman" w:hAnsi="Times New Roman" w:eastAsia="Times New Roman" w:cs="Times New Roman"/>
           <w:sz w:val="24"/>
           <w:szCs w:val="24"/>
           <w:lang w:eastAsia="en-ID"/>
@@ -9000,7 +9000,7 @@
       <w:pPr>
         <w:spacing w:after="0" w:line="276" w:lineRule="auto"/>
         <w:rPr>
-          <w:rFonts w:ascii="Times New Roman" w:eastAsia="Times New Roman" w:hAnsi="Times New Roman" w:cs="Times New Roman"/>
+          <w:rFonts w:ascii="Times New Roman" w:hAnsi="Times New Roman" w:eastAsia="Times New Roman" w:cs="Times New Roman"/>
           <w:sz w:val="24"/>
           <w:szCs w:val="24"/>
           <w:lang w:eastAsia="en-ID"/>
@@ -9008,7 +9008,7 @@
       </w:pPr>
       <w:r>
         <w:rPr>
-          <w:rFonts w:ascii="Times New Roman" w:eastAsia="Times New Roman" w:hAnsi="Times New Roman" w:cs="Times New Roman"/>
+          <w:rFonts w:ascii="Times New Roman" w:hAnsi="Times New Roman" w:eastAsia="Times New Roman" w:cs="Times New Roman"/>
           <w:sz w:val="24"/>
           <w:szCs w:val="24"/>
           <w:lang w:eastAsia="en-ID"/>
@@ -9018,7 +9018,7 @@
       <w:proofErr w:type="spellStart"/>
       <w:r>
         <w:rPr>
-          <w:rFonts w:ascii="Times New Roman" w:eastAsia="Times New Roman" w:hAnsi="Times New Roman" w:cs="Times New Roman"/>
+          <w:rFonts w:ascii="Times New Roman" w:hAnsi="Times New Roman" w:eastAsia="Times New Roman" w:cs="Times New Roman"/>
           <w:sz w:val="24"/>
           <w:szCs w:val="24"/>
           <w:lang w:eastAsia="en-ID"/>
@@ -9028,7 +9028,7 @@
       <w:proofErr w:type="spellEnd"/>
       <w:r>
         <w:rPr>
-          <w:rFonts w:ascii="Times New Roman" w:eastAsia="Times New Roman" w:hAnsi="Times New Roman" w:cs="Times New Roman"/>
+          <w:rFonts w:ascii="Times New Roman" w:hAnsi="Times New Roman" w:eastAsia="Times New Roman" w:cs="Times New Roman"/>
           <w:sz w:val="24"/>
           <w:szCs w:val="24"/>
           <w:lang w:eastAsia="en-ID"/>
@@ -9038,7 +9038,7 @@
       <w:proofErr w:type="spellStart"/>
       <w:r>
         <w:rPr>
-          <w:rFonts w:ascii="Times New Roman" w:eastAsia="Times New Roman" w:hAnsi="Times New Roman" w:cs="Times New Roman"/>
+          <w:rFonts w:ascii="Times New Roman" w:hAnsi="Times New Roman" w:eastAsia="Times New Roman" w:cs="Times New Roman"/>
           <w:sz w:val="24"/>
           <w:szCs w:val="24"/>
           <w:lang w:eastAsia="en-ID"/>
@@ -9048,7 +9048,7 @@
       <w:proofErr w:type="spellEnd"/>
       <w:r>
         <w:rPr>
-          <w:rFonts w:ascii="Times New Roman" w:eastAsia="Times New Roman" w:hAnsi="Times New Roman" w:cs="Times New Roman"/>
+          <w:rFonts w:ascii="Times New Roman" w:hAnsi="Times New Roman" w:eastAsia="Times New Roman" w:cs="Times New Roman"/>
           <w:sz w:val="24"/>
           <w:szCs w:val="24"/>
           <w:lang w:eastAsia="en-ID"/>
@@ -9058,7 +9058,7 @@
       <w:proofErr w:type="spellStart"/>
       <w:r>
         <w:rPr>
-          <w:rFonts w:ascii="Times New Roman" w:eastAsia="Times New Roman" w:hAnsi="Times New Roman" w:cs="Times New Roman"/>
+          <w:rFonts w:ascii="Times New Roman" w:hAnsi="Times New Roman" w:eastAsia="Times New Roman" w:cs="Times New Roman"/>
           <w:sz w:val="24"/>
           <w:szCs w:val="24"/>
           <w:lang w:eastAsia="en-ID"/>
@@ -9068,7 +9068,7 @@
       <w:proofErr w:type="spellEnd"/>
       <w:r>
         <w:rPr>
-          <w:rFonts w:ascii="Times New Roman" w:eastAsia="Times New Roman" w:hAnsi="Times New Roman" w:cs="Times New Roman"/>
+          <w:rFonts w:ascii="Times New Roman" w:hAnsi="Times New Roman" w:eastAsia="Times New Roman" w:cs="Times New Roman"/>
           <w:sz w:val="24"/>
           <w:szCs w:val="24"/>
           <w:lang w:eastAsia="en-ID"/>
@@ -9078,7 +9078,7 @@
       <w:proofErr w:type="spellStart"/>
       <w:r>
         <w:rPr>
-          <w:rFonts w:ascii="Times New Roman" w:eastAsia="Times New Roman" w:hAnsi="Times New Roman" w:cs="Times New Roman"/>
+          <w:rFonts w:ascii="Times New Roman" w:hAnsi="Times New Roman" w:eastAsia="Times New Roman" w:cs="Times New Roman"/>
           <w:sz w:val="24"/>
           <w:szCs w:val="24"/>
           <w:lang w:eastAsia="en-ID"/>
@@ -9088,7 +9088,7 @@
       <w:proofErr w:type="spellEnd"/>
       <w:r>
         <w:rPr>
-          <w:rFonts w:ascii="Times New Roman" w:eastAsia="Times New Roman" w:hAnsi="Times New Roman" w:cs="Times New Roman"/>
+          <w:rFonts w:ascii="Times New Roman" w:hAnsi="Times New Roman" w:eastAsia="Times New Roman" w:cs="Times New Roman"/>
           <w:sz w:val="24"/>
           <w:szCs w:val="24"/>
           <w:lang w:eastAsia="en-ID"/>
@@ -9098,7 +9098,7 @@
       <w:proofErr w:type="spellStart"/>
       <w:r>
         <w:rPr>
-          <w:rFonts w:ascii="Times New Roman" w:eastAsia="Times New Roman" w:hAnsi="Times New Roman" w:cs="Times New Roman"/>
+          <w:rFonts w:ascii="Times New Roman" w:hAnsi="Times New Roman" w:eastAsia="Times New Roman" w:cs="Times New Roman"/>
           <w:b/>
           <w:bCs/>
           <w:sz w:val="24"/>
@@ -9110,7 +9110,7 @@
       <w:proofErr w:type="spellEnd"/>
       <w:r>
         <w:rPr>
-          <w:rFonts w:ascii="Times New Roman" w:eastAsia="Times New Roman" w:hAnsi="Times New Roman" w:cs="Times New Roman"/>
+          <w:rFonts w:ascii="Times New Roman" w:hAnsi="Times New Roman" w:eastAsia="Times New Roman" w:cs="Times New Roman"/>
           <w:b/>
           <w:bCs/>
           <w:sz w:val="24"/>
@@ -9132,7 +9132,7 @@
         </w:tabs>
         <w:spacing w:after="0" w:line="276" w:lineRule="auto"/>
         <w:rPr>
-          <w:rFonts w:ascii="Times New Roman" w:eastAsia="Times New Roman" w:hAnsi="Times New Roman" w:cs="Times New Roman"/>
+          <w:rFonts w:ascii="Times New Roman" w:hAnsi="Times New Roman" w:eastAsia="Times New Roman" w:cs="Times New Roman"/>
           <w:sz w:val="24"/>
           <w:szCs w:val="24"/>
           <w:lang w:eastAsia="en-ID"/>
@@ -9140,7 +9140,7 @@
       </w:pPr>
       <w:r>
         <w:rPr>
-          <w:rFonts w:ascii="Times New Roman" w:eastAsia="Times New Roman" w:hAnsi="Times New Roman" w:cs="Times New Roman"/>
+          <w:rFonts w:ascii="Times New Roman" w:hAnsi="Times New Roman" w:eastAsia="Times New Roman" w:cs="Times New Roman"/>
           <w:sz w:val="24"/>
           <w:szCs w:val="24"/>
           <w:lang w:eastAsia="en-ID"/>
@@ -9150,7 +9150,7 @@
       <w:proofErr w:type="spellStart"/>
       <w:r>
         <w:rPr>
-          <w:rFonts w:ascii="Courier New" w:eastAsia="Times New Roman" w:hAnsi="Courier New" w:cs="Courier New"/>
+          <w:rFonts w:ascii="Courier New" w:hAnsi="Courier New" w:eastAsia="Times New Roman" w:cs="Courier New"/>
           <w:sz w:val="20"/>
           <w:szCs w:val="20"/>
           <w:lang w:eastAsia="en-ID"/>
@@ -9164,7 +9164,7 @@
         <w:spacing w:after="0" w:line="276" w:lineRule="auto"/>
         <w:ind w:left="851"/>
         <w:rPr>
-          <w:rFonts w:ascii="Times New Roman" w:eastAsia="Times New Roman" w:hAnsi="Times New Roman" w:cs="Times New Roman"/>
+          <w:rFonts w:ascii="Times New Roman" w:hAnsi="Times New Roman" w:eastAsia="Times New Roman" w:cs="Times New Roman"/>
           <w:sz w:val="24"/>
           <w:szCs w:val="24"/>
           <w:lang w:eastAsia="en-ID"/>
@@ -9172,7 +9172,7 @@
       </w:pPr>
       <w:r>
         <w:rPr>
-          <w:rFonts w:ascii="Times New Roman" w:eastAsia="Times New Roman" w:hAnsi="Times New Roman" w:cs="Times New Roman"/>
+          <w:rFonts w:ascii="Times New Roman" w:hAnsi="Times New Roman" w:eastAsia="Times New Roman" w:cs="Times New Roman"/>
           <w:sz w:val="24"/>
           <w:szCs w:val="24"/>
           <w:lang w:eastAsia="en-ID"/>
@@ -9182,7 +9182,7 @@
       <w:proofErr w:type="spellStart"/>
       <w:r>
         <w:rPr>
-          <w:rFonts w:ascii="Courier New" w:eastAsia="Times New Roman" w:hAnsi="Courier New" w:cs="Courier New"/>
+          <w:rFonts w:ascii="Courier New" w:hAnsi="Courier New" w:eastAsia="Times New Roman" w:cs="Courier New"/>
           <w:sz w:val="20"/>
           <w:szCs w:val="20"/>
           <w:lang w:eastAsia="en-ID"/>
@@ -13270,7 +13270,7 @@
         <w:ind w:left="1440" w:hanging="360"/>
       </w:pPr>
       <w:rPr>
-        <w:rFonts w:ascii="Courier New" w:hAnsi="Courier New" w:hint="default"/>
+        <w:rFonts w:hint="default" w:ascii="Courier New" w:hAnsi="Courier New"/>
         <w:sz w:val="20"/>
       </w:rPr>
     </w:lvl>
@@ -13286,7 +13286,7 @@
         <w:ind w:left="2160" w:hanging="360"/>
       </w:pPr>
       <w:rPr>
-        <w:rFonts w:ascii="Wingdings" w:hAnsi="Wingdings" w:hint="default"/>
+        <w:rFonts w:hint="default" w:ascii="Wingdings" w:hAnsi="Wingdings"/>
         <w:sz w:val="20"/>
       </w:rPr>
     </w:lvl>
@@ -13302,7 +13302,7 @@
         <w:ind w:left="2880" w:hanging="360"/>
       </w:pPr>
       <w:rPr>
-        <w:rFonts w:ascii="Wingdings" w:hAnsi="Wingdings" w:hint="default"/>
+        <w:rFonts w:hint="default" w:ascii="Wingdings" w:hAnsi="Wingdings"/>
         <w:sz w:val="20"/>
       </w:rPr>
     </w:lvl>
@@ -13318,7 +13318,7 @@
         <w:ind w:left="3600" w:hanging="360"/>
       </w:pPr>
       <w:rPr>
-        <w:rFonts w:ascii="Wingdings" w:hAnsi="Wingdings" w:hint="default"/>
+        <w:rFonts w:hint="default" w:ascii="Wingdings" w:hAnsi="Wingdings"/>
         <w:sz w:val="20"/>
       </w:rPr>
     </w:lvl>
@@ -13334,7 +13334,7 @@
         <w:ind w:left="4320" w:hanging="360"/>
       </w:pPr>
       <w:rPr>
-        <w:rFonts w:ascii="Wingdings" w:hAnsi="Wingdings" w:hint="default"/>
+        <w:rFonts w:hint="default" w:ascii="Wingdings" w:hAnsi="Wingdings"/>
         <w:sz w:val="20"/>
       </w:rPr>
     </w:lvl>
@@ -13350,7 +13350,7 @@
         <w:ind w:left="5040" w:hanging="360"/>
       </w:pPr>
       <w:rPr>
-        <w:rFonts w:ascii="Wingdings" w:hAnsi="Wingdings" w:hint="default"/>
+        <w:rFonts w:hint="default" w:ascii="Wingdings" w:hAnsi="Wingdings"/>
         <w:sz w:val="20"/>
       </w:rPr>
     </w:lvl>
@@ -13366,7 +13366,7 @@
         <w:ind w:left="5760" w:hanging="360"/>
       </w:pPr>
       <w:rPr>
-        <w:rFonts w:ascii="Wingdings" w:hAnsi="Wingdings" w:hint="default"/>
+        <w:rFonts w:hint="default" w:ascii="Wingdings" w:hAnsi="Wingdings"/>
         <w:sz w:val="20"/>
       </w:rPr>
     </w:lvl>
@@ -13382,7 +13382,7 @@
         <w:ind w:left="6480" w:hanging="360"/>
       </w:pPr>
       <w:rPr>
-        <w:rFonts w:ascii="Wingdings" w:hAnsi="Wingdings" w:hint="default"/>
+        <w:rFonts w:hint="default" w:ascii="Wingdings" w:hAnsi="Wingdings"/>
         <w:sz w:val="20"/>
       </w:rPr>
     </w:lvl>
@@ -13403,7 +13403,7 @@
         <w:ind w:left="720" w:hanging="360"/>
       </w:pPr>
       <w:rPr>
-        <w:rFonts w:ascii="Symbol" w:hAnsi="Symbol" w:hint="default"/>
+        <w:rFonts w:hint="default" w:ascii="Symbol" w:hAnsi="Symbol"/>
         <w:sz w:val="20"/>
       </w:rPr>
     </w:lvl>
@@ -13419,7 +13419,7 @@
         <w:ind w:left="1440" w:hanging="360"/>
       </w:pPr>
       <w:rPr>
-        <w:rFonts w:ascii="Courier New" w:hAnsi="Courier New" w:hint="default"/>
+        <w:rFonts w:hint="default" w:ascii="Courier New" w:hAnsi="Courier New"/>
         <w:sz w:val="20"/>
       </w:rPr>
     </w:lvl>
@@ -13435,7 +13435,7 @@
         <w:ind w:left="2160" w:hanging="360"/>
       </w:pPr>
       <w:rPr>
-        <w:rFonts w:ascii="Wingdings" w:hAnsi="Wingdings" w:hint="default"/>
+        <w:rFonts w:hint="default" w:ascii="Wingdings" w:hAnsi="Wingdings"/>
         <w:sz w:val="20"/>
       </w:rPr>
     </w:lvl>
@@ -13451,7 +13451,7 @@
         <w:ind w:left="2880" w:hanging="360"/>
       </w:pPr>
       <w:rPr>
-        <w:rFonts w:ascii="Wingdings" w:hAnsi="Wingdings" w:hint="default"/>
+        <w:rFonts w:hint="default" w:ascii="Wingdings" w:hAnsi="Wingdings"/>
         <w:sz w:val="20"/>
       </w:rPr>
     </w:lvl>
@@ -13467,7 +13467,7 @@
         <w:ind w:left="3600" w:hanging="360"/>
       </w:pPr>
       <w:rPr>
-        <w:rFonts w:ascii="Wingdings" w:hAnsi="Wingdings" w:hint="default"/>
+        <w:rFonts w:hint="default" w:ascii="Wingdings" w:hAnsi="Wingdings"/>
         <w:sz w:val="20"/>
       </w:rPr>
     </w:lvl>
@@ -13483,7 +13483,7 @@
         <w:ind w:left="4320" w:hanging="360"/>
       </w:pPr>
       <w:rPr>
-        <w:rFonts w:ascii="Wingdings" w:hAnsi="Wingdings" w:hint="default"/>
+        <w:rFonts w:hint="default" w:ascii="Wingdings" w:hAnsi="Wingdings"/>
         <w:sz w:val="20"/>
       </w:rPr>
     </w:lvl>
@@ -13499,7 +13499,7 @@
         <w:ind w:left="5040" w:hanging="360"/>
       </w:pPr>
       <w:rPr>
-        <w:rFonts w:ascii="Wingdings" w:hAnsi="Wingdings" w:hint="default"/>
+        <w:rFonts w:hint="default" w:ascii="Wingdings" w:hAnsi="Wingdings"/>
         <w:sz w:val="20"/>
       </w:rPr>
     </w:lvl>
@@ -13515,7 +13515,7 @@
         <w:ind w:left="5760" w:hanging="360"/>
       </w:pPr>
       <w:rPr>
-        <w:rFonts w:ascii="Wingdings" w:hAnsi="Wingdings" w:hint="default"/>
+        <w:rFonts w:hint="default" w:ascii="Wingdings" w:hAnsi="Wingdings"/>
         <w:sz w:val="20"/>
       </w:rPr>
     </w:lvl>
@@ -13531,7 +13531,7 @@
         <w:ind w:left="6480" w:hanging="360"/>
       </w:pPr>
       <w:rPr>
-        <w:rFonts w:ascii="Wingdings" w:hAnsi="Wingdings" w:hint="default"/>
+        <w:rFonts w:hint="default" w:ascii="Wingdings" w:hAnsi="Wingdings"/>
         <w:sz w:val="20"/>
       </w:rPr>
     </w:lvl>
@@ -13552,7 +13552,7 @@
         <w:ind w:left="720" w:hanging="360"/>
       </w:pPr>
       <w:rPr>
-        <w:rFonts w:ascii="Symbol" w:hAnsi="Symbol" w:hint="default"/>
+        <w:rFonts w:hint="default" w:ascii="Symbol" w:hAnsi="Symbol"/>
         <w:sz w:val="20"/>
       </w:rPr>
     </w:lvl>
@@ -13568,7 +13568,7 @@
         <w:ind w:left="1440" w:hanging="360"/>
       </w:pPr>
       <w:rPr>
-        <w:rFonts w:ascii="Courier New" w:hAnsi="Courier New" w:hint="default"/>
+        <w:rFonts w:hint="default" w:ascii="Courier New" w:hAnsi="Courier New"/>
         <w:sz w:val="20"/>
       </w:rPr>
     </w:lvl>
@@ -13584,7 +13584,7 @@
         <w:ind w:left="2160" w:hanging="360"/>
       </w:pPr>
       <w:rPr>
-        <w:rFonts w:ascii="Wingdings" w:hAnsi="Wingdings" w:hint="default"/>
+        <w:rFonts w:hint="default" w:ascii="Wingdings" w:hAnsi="Wingdings"/>
         <w:sz w:val="20"/>
       </w:rPr>
     </w:lvl>
@@ -13600,7 +13600,7 @@
         <w:ind w:left="2880" w:hanging="360"/>
       </w:pPr>
       <w:rPr>
-        <w:rFonts w:ascii="Wingdings" w:hAnsi="Wingdings" w:hint="default"/>
+        <w:rFonts w:hint="default" w:ascii="Wingdings" w:hAnsi="Wingdings"/>
         <w:sz w:val="20"/>
       </w:rPr>
     </w:lvl>
@@ -13616,7 +13616,7 @@
         <w:ind w:left="3600" w:hanging="360"/>
       </w:pPr>
       <w:rPr>
-        <w:rFonts w:ascii="Wingdings" w:hAnsi="Wingdings" w:hint="default"/>
+        <w:rFonts w:hint="default" w:ascii="Wingdings" w:hAnsi="Wingdings"/>
         <w:sz w:val="20"/>
       </w:rPr>
     </w:lvl>
@@ -13632,7 +13632,7 @@
         <w:ind w:left="4320" w:hanging="360"/>
       </w:pPr>
       <w:rPr>
-        <w:rFonts w:ascii="Wingdings" w:hAnsi="Wingdings" w:hint="default"/>
+        <w:rFonts w:hint="default" w:ascii="Wingdings" w:hAnsi="Wingdings"/>
         <w:sz w:val="20"/>
       </w:rPr>
     </w:lvl>
@@ -13648,7 +13648,7 @@
         <w:ind w:left="5040" w:hanging="360"/>
       </w:pPr>
       <w:rPr>
-        <w:rFonts w:ascii="Wingdings" w:hAnsi="Wingdings" w:hint="default"/>
+        <w:rFonts w:hint="default" w:ascii="Wingdings" w:hAnsi="Wingdings"/>
         <w:sz w:val="20"/>
       </w:rPr>
     </w:lvl>
@@ -13664,7 +13664,7 @@
         <w:ind w:left="5760" w:hanging="360"/>
       </w:pPr>
       <w:rPr>
-        <w:rFonts w:ascii="Wingdings" w:hAnsi="Wingdings" w:hint="default"/>
+        <w:rFonts w:hint="default" w:ascii="Wingdings" w:hAnsi="Wingdings"/>
         <w:sz w:val="20"/>
       </w:rPr>
     </w:lvl>
@@ -13680,7 +13680,7 @@
         <w:ind w:left="6480" w:hanging="360"/>
       </w:pPr>
       <w:rPr>
-        <w:rFonts w:ascii="Wingdings" w:hAnsi="Wingdings" w:hint="default"/>
+        <w:rFonts w:hint="default" w:ascii="Wingdings" w:hAnsi="Wingdings"/>
         <w:sz w:val="20"/>
       </w:rPr>
     </w:lvl>
@@ -13814,7 +13814,7 @@
         <w:ind w:left="720" w:hanging="360"/>
       </w:pPr>
       <w:rPr>
-        <w:rFonts w:ascii="Symbol" w:hAnsi="Symbol" w:hint="default"/>
+        <w:rFonts w:hint="default" w:ascii="Symbol" w:hAnsi="Symbol"/>
         <w:sz w:val="20"/>
       </w:rPr>
     </w:lvl>
@@ -13830,7 +13830,7 @@
         <w:ind w:left="1440" w:hanging="360"/>
       </w:pPr>
       <w:rPr>
-        <w:rFonts w:ascii="Courier New" w:hAnsi="Courier New" w:hint="default"/>
+        <w:rFonts w:hint="default" w:ascii="Courier New" w:hAnsi="Courier New"/>
         <w:sz w:val="20"/>
       </w:rPr>
     </w:lvl>
@@ -13846,7 +13846,7 @@
         <w:ind w:left="2160" w:hanging="360"/>
       </w:pPr>
       <w:rPr>
-        <w:rFonts w:ascii="Wingdings" w:hAnsi="Wingdings" w:hint="default"/>
+        <w:rFonts w:hint="default" w:ascii="Wingdings" w:hAnsi="Wingdings"/>
         <w:sz w:val="20"/>
       </w:rPr>
     </w:lvl>
@@ -13862,7 +13862,7 @@
         <w:ind w:left="2880" w:hanging="360"/>
       </w:pPr>
       <w:rPr>
-        <w:rFonts w:ascii="Wingdings" w:hAnsi="Wingdings" w:hint="default"/>
+        <w:rFonts w:hint="default" w:ascii="Wingdings" w:hAnsi="Wingdings"/>
         <w:sz w:val="20"/>
       </w:rPr>
     </w:lvl>
@@ -13878,7 +13878,7 @@
         <w:ind w:left="3600" w:hanging="360"/>
       </w:pPr>
       <w:rPr>
-        <w:rFonts w:ascii="Wingdings" w:hAnsi="Wingdings" w:hint="default"/>
+        <w:rFonts w:hint="default" w:ascii="Wingdings" w:hAnsi="Wingdings"/>
         <w:sz w:val="20"/>
       </w:rPr>
     </w:lvl>
@@ -13894,7 +13894,7 @@
         <w:ind w:left="4320" w:hanging="360"/>
       </w:pPr>
       <w:rPr>
-        <w:rFonts w:ascii="Wingdings" w:hAnsi="Wingdings" w:hint="default"/>
+        <w:rFonts w:hint="default" w:ascii="Wingdings" w:hAnsi="Wingdings"/>
         <w:sz w:val="20"/>
       </w:rPr>
     </w:lvl>
@@ -13910,7 +13910,7 @@
         <w:ind w:left="5040" w:hanging="360"/>
       </w:pPr>
       <w:rPr>
-        <w:rFonts w:ascii="Wingdings" w:hAnsi="Wingdings" w:hint="default"/>
+        <w:rFonts w:hint="default" w:ascii="Wingdings" w:hAnsi="Wingdings"/>
         <w:sz w:val="20"/>
       </w:rPr>
     </w:lvl>
@@ -13926,7 +13926,7 @@
         <w:ind w:left="5760" w:hanging="360"/>
       </w:pPr>
       <w:rPr>
-        <w:rFonts w:ascii="Wingdings" w:hAnsi="Wingdings" w:hint="default"/>
+        <w:rFonts w:hint="default" w:ascii="Wingdings" w:hAnsi="Wingdings"/>
         <w:sz w:val="20"/>
       </w:rPr>
     </w:lvl>
@@ -13942,7 +13942,7 @@
         <w:ind w:left="6480" w:hanging="360"/>
       </w:pPr>
       <w:rPr>
-        <w:rFonts w:ascii="Wingdings" w:hAnsi="Wingdings" w:hint="default"/>
+        <w:rFonts w:hint="default" w:ascii="Wingdings" w:hAnsi="Wingdings"/>
         <w:sz w:val="20"/>
       </w:rPr>
     </w:lvl>
@@ -13963,7 +13963,7 @@
         <w:ind w:left="720" w:hanging="360"/>
       </w:pPr>
       <w:rPr>
-        <w:rFonts w:ascii="Symbol" w:hAnsi="Symbol" w:hint="default"/>
+        <w:rFonts w:hint="default" w:ascii="Symbol" w:hAnsi="Symbol"/>
         <w:sz w:val="20"/>
       </w:rPr>
     </w:lvl>
@@ -13979,7 +13979,7 @@
         <w:ind w:left="1440" w:hanging="360"/>
       </w:pPr>
       <w:rPr>
-        <w:rFonts w:ascii="Courier New" w:hAnsi="Courier New" w:hint="default"/>
+        <w:rFonts w:hint="default" w:ascii="Courier New" w:hAnsi="Courier New"/>
         <w:sz w:val="20"/>
       </w:rPr>
     </w:lvl>
@@ -13995,7 +13995,7 @@
         <w:ind w:left="2160" w:hanging="360"/>
       </w:pPr>
       <w:rPr>
-        <w:rFonts w:ascii="Wingdings" w:hAnsi="Wingdings" w:hint="default"/>
+        <w:rFonts w:hint="default" w:ascii="Wingdings" w:hAnsi="Wingdings"/>
         <w:sz w:val="20"/>
       </w:rPr>
     </w:lvl>
@@ -14011,7 +14011,7 @@
         <w:ind w:left="2880" w:hanging="360"/>
       </w:pPr>
       <w:rPr>
-        <w:rFonts w:ascii="Wingdings" w:hAnsi="Wingdings" w:hint="default"/>
+        <w:rFonts w:hint="default" w:ascii="Wingdings" w:hAnsi="Wingdings"/>
         <w:sz w:val="20"/>
       </w:rPr>
     </w:lvl>
@@ -14027,7 +14027,7 @@
         <w:ind w:left="3600" w:hanging="360"/>
       </w:pPr>
       <w:rPr>
-        <w:rFonts w:ascii="Wingdings" w:hAnsi="Wingdings" w:hint="default"/>
+        <w:rFonts w:hint="default" w:ascii="Wingdings" w:hAnsi="Wingdings"/>
         <w:sz w:val="20"/>
       </w:rPr>
     </w:lvl>
@@ -14043,7 +14043,7 @@
         <w:ind w:left="4320" w:hanging="360"/>
       </w:pPr>
       <w:rPr>
-        <w:rFonts w:ascii="Wingdings" w:hAnsi="Wingdings" w:hint="default"/>
+        <w:rFonts w:hint="default" w:ascii="Wingdings" w:hAnsi="Wingdings"/>
         <w:sz w:val="20"/>
       </w:rPr>
     </w:lvl>
@@ -14059,7 +14059,7 @@
         <w:ind w:left="5040" w:hanging="360"/>
       </w:pPr>
       <w:rPr>
-        <w:rFonts w:ascii="Wingdings" w:hAnsi="Wingdings" w:hint="default"/>
+        <w:rFonts w:hint="default" w:ascii="Wingdings" w:hAnsi="Wingdings"/>
         <w:sz w:val="20"/>
       </w:rPr>
     </w:lvl>
@@ -14075,7 +14075,7 @@
         <w:ind w:left="5760" w:hanging="360"/>
       </w:pPr>
       <w:rPr>
-        <w:rFonts w:ascii="Wingdings" w:hAnsi="Wingdings" w:hint="default"/>
+        <w:rFonts w:hint="default" w:ascii="Wingdings" w:hAnsi="Wingdings"/>
         <w:sz w:val="20"/>
       </w:rPr>
     </w:lvl>
@@ -14091,7 +14091,7 @@
         <w:ind w:left="6480" w:hanging="360"/>
       </w:pPr>
       <w:rPr>
-        <w:rFonts w:ascii="Wingdings" w:hAnsi="Wingdings" w:hint="default"/>
+        <w:rFonts w:hint="default" w:ascii="Wingdings" w:hAnsi="Wingdings"/>
         <w:sz w:val="20"/>
       </w:rPr>
     </w:lvl>
@@ -14243,7 +14243,7 @@
         <w:ind w:left="1440" w:hanging="360"/>
       </w:pPr>
       <w:rPr>
-        <w:rFonts w:ascii="Courier New" w:hAnsi="Courier New" w:hint="default"/>
+        <w:rFonts w:hint="default" w:ascii="Courier New" w:hAnsi="Courier New"/>
         <w:sz w:val="20"/>
       </w:rPr>
     </w:lvl>
@@ -14259,7 +14259,7 @@
         <w:ind w:left="2160" w:hanging="360"/>
       </w:pPr>
       <w:rPr>
-        <w:rFonts w:ascii="Wingdings" w:hAnsi="Wingdings" w:hint="default"/>
+        <w:rFonts w:hint="default" w:ascii="Wingdings" w:hAnsi="Wingdings"/>
         <w:sz w:val="20"/>
       </w:rPr>
     </w:lvl>
@@ -14275,7 +14275,7 @@
         <w:ind w:left="2880" w:hanging="360"/>
       </w:pPr>
       <w:rPr>
-        <w:rFonts w:ascii="Wingdings" w:hAnsi="Wingdings" w:hint="default"/>
+        <w:rFonts w:hint="default" w:ascii="Wingdings" w:hAnsi="Wingdings"/>
         <w:sz w:val="20"/>
       </w:rPr>
     </w:lvl>
@@ -14291,7 +14291,7 @@
         <w:ind w:left="3600" w:hanging="360"/>
       </w:pPr>
       <w:rPr>
-        <w:rFonts w:ascii="Wingdings" w:hAnsi="Wingdings" w:hint="default"/>
+        <w:rFonts w:hint="default" w:ascii="Wingdings" w:hAnsi="Wingdings"/>
         <w:sz w:val="20"/>
       </w:rPr>
     </w:lvl>
@@ -14307,7 +14307,7 @@
         <w:ind w:left="4320" w:hanging="360"/>
       </w:pPr>
       <w:rPr>
-        <w:rFonts w:ascii="Wingdings" w:hAnsi="Wingdings" w:hint="default"/>
+        <w:rFonts w:hint="default" w:ascii="Wingdings" w:hAnsi="Wingdings"/>
         <w:sz w:val="20"/>
       </w:rPr>
     </w:lvl>
@@ -14323,7 +14323,7 @@
         <w:ind w:left="5040" w:hanging="360"/>
       </w:pPr>
       <w:rPr>
-        <w:rFonts w:ascii="Wingdings" w:hAnsi="Wingdings" w:hint="default"/>
+        <w:rFonts w:hint="default" w:ascii="Wingdings" w:hAnsi="Wingdings"/>
         <w:sz w:val="20"/>
       </w:rPr>
     </w:lvl>
@@ -14339,7 +14339,7 @@
         <w:ind w:left="5760" w:hanging="360"/>
       </w:pPr>
       <w:rPr>
-        <w:rFonts w:ascii="Wingdings" w:hAnsi="Wingdings" w:hint="default"/>
+        <w:rFonts w:hint="default" w:ascii="Wingdings" w:hAnsi="Wingdings"/>
         <w:sz w:val="20"/>
       </w:rPr>
     </w:lvl>
@@ -14355,7 +14355,7 @@
         <w:ind w:left="6480" w:hanging="360"/>
       </w:pPr>
       <w:rPr>
-        <w:rFonts w:ascii="Wingdings" w:hAnsi="Wingdings" w:hint="default"/>
+        <w:rFonts w:hint="default" w:ascii="Wingdings" w:hAnsi="Wingdings"/>
         <w:sz w:val="20"/>
       </w:rPr>
     </w:lvl>
@@ -14407,7 +14407,7 @@
         <w:ind w:left="2160" w:hanging="360"/>
       </w:pPr>
       <w:rPr>
-        <w:rFonts w:ascii="Wingdings" w:hAnsi="Wingdings" w:hint="default"/>
+        <w:rFonts w:hint="default" w:ascii="Wingdings" w:hAnsi="Wingdings"/>
         <w:sz w:val="20"/>
       </w:rPr>
     </w:lvl>
@@ -14423,7 +14423,7 @@
         <w:ind w:left="2880" w:hanging="360"/>
       </w:pPr>
       <w:rPr>
-        <w:rFonts w:ascii="Wingdings" w:hAnsi="Wingdings" w:hint="default"/>
+        <w:rFonts w:hint="default" w:ascii="Wingdings" w:hAnsi="Wingdings"/>
         <w:sz w:val="20"/>
       </w:rPr>
     </w:lvl>
@@ -14439,7 +14439,7 @@
         <w:ind w:left="3600" w:hanging="360"/>
       </w:pPr>
       <w:rPr>
-        <w:rFonts w:ascii="Wingdings" w:hAnsi="Wingdings" w:hint="default"/>
+        <w:rFonts w:hint="default" w:ascii="Wingdings" w:hAnsi="Wingdings"/>
         <w:sz w:val="20"/>
       </w:rPr>
     </w:lvl>
@@ -14455,7 +14455,7 @@
         <w:ind w:left="4320" w:hanging="360"/>
       </w:pPr>
       <w:rPr>
-        <w:rFonts w:ascii="Wingdings" w:hAnsi="Wingdings" w:hint="default"/>
+        <w:rFonts w:hint="default" w:ascii="Wingdings" w:hAnsi="Wingdings"/>
         <w:sz w:val="20"/>
       </w:rPr>
     </w:lvl>
@@ -14471,7 +14471,7 @@
         <w:ind w:left="5040" w:hanging="360"/>
       </w:pPr>
       <w:rPr>
-        <w:rFonts w:ascii="Wingdings" w:hAnsi="Wingdings" w:hint="default"/>
+        <w:rFonts w:hint="default" w:ascii="Wingdings" w:hAnsi="Wingdings"/>
         <w:sz w:val="20"/>
       </w:rPr>
     </w:lvl>
@@ -14487,7 +14487,7 @@
         <w:ind w:left="5760" w:hanging="360"/>
       </w:pPr>
       <w:rPr>
-        <w:rFonts w:ascii="Wingdings" w:hAnsi="Wingdings" w:hint="default"/>
+        <w:rFonts w:hint="default" w:ascii="Wingdings" w:hAnsi="Wingdings"/>
         <w:sz w:val="20"/>
       </w:rPr>
     </w:lvl>
@@ -14503,7 +14503,7 @@
         <w:ind w:left="6480" w:hanging="360"/>
       </w:pPr>
       <w:rPr>
-        <w:rFonts w:ascii="Wingdings" w:hAnsi="Wingdings" w:hint="default"/>
+        <w:rFonts w:hint="default" w:ascii="Wingdings" w:hAnsi="Wingdings"/>
         <w:sz w:val="20"/>
       </w:rPr>
     </w:lvl>
@@ -14524,7 +14524,7 @@
         <w:ind w:left="720" w:hanging="360"/>
       </w:pPr>
       <w:rPr>
-        <w:rFonts w:ascii="Symbol" w:hAnsi="Symbol" w:hint="default"/>
+        <w:rFonts w:hint="default" w:ascii="Symbol" w:hAnsi="Symbol"/>
         <w:sz w:val="20"/>
       </w:rPr>
     </w:lvl>
@@ -14540,7 +14540,7 @@
         <w:ind w:left="1440" w:hanging="360"/>
       </w:pPr>
       <w:rPr>
-        <w:rFonts w:ascii="Courier New" w:hAnsi="Courier New" w:hint="default"/>
+        <w:rFonts w:hint="default" w:ascii="Courier New" w:hAnsi="Courier New"/>
         <w:sz w:val="20"/>
       </w:rPr>
     </w:lvl>
@@ -14556,7 +14556,7 @@
         <w:ind w:left="2160" w:hanging="360"/>
       </w:pPr>
       <w:rPr>
-        <w:rFonts w:ascii="Wingdings" w:hAnsi="Wingdings" w:hint="default"/>
+        <w:rFonts w:hint="default" w:ascii="Wingdings" w:hAnsi="Wingdings"/>
         <w:sz w:val="20"/>
       </w:rPr>
     </w:lvl>
@@ -14572,7 +14572,7 @@
         <w:ind w:left="2880" w:hanging="360"/>
       </w:pPr>
       <w:rPr>
-        <w:rFonts w:ascii="Wingdings" w:hAnsi="Wingdings" w:hint="default"/>
+        <w:rFonts w:hint="default" w:ascii="Wingdings" w:hAnsi="Wingdings"/>
         <w:sz w:val="20"/>
       </w:rPr>
     </w:lvl>
@@ -14588,7 +14588,7 @@
         <w:ind w:left="3600" w:hanging="360"/>
       </w:pPr>
       <w:rPr>
-        <w:rFonts w:ascii="Wingdings" w:hAnsi="Wingdings" w:hint="default"/>
+        <w:rFonts w:hint="default" w:ascii="Wingdings" w:hAnsi="Wingdings"/>
         <w:sz w:val="20"/>
       </w:rPr>
     </w:lvl>
@@ -14604,7 +14604,7 @@
         <w:ind w:left="4320" w:hanging="360"/>
       </w:pPr>
       <w:rPr>
-        <w:rFonts w:ascii="Wingdings" w:hAnsi="Wingdings" w:hint="default"/>
+        <w:rFonts w:hint="default" w:ascii="Wingdings" w:hAnsi="Wingdings"/>
         <w:sz w:val="20"/>
       </w:rPr>
     </w:lvl>
@@ -14620,7 +14620,7 @@
         <w:ind w:left="5040" w:hanging="360"/>
       </w:pPr>
       <w:rPr>
-        <w:rFonts w:ascii="Wingdings" w:hAnsi="Wingdings" w:hint="default"/>
+        <w:rFonts w:hint="default" w:ascii="Wingdings" w:hAnsi="Wingdings"/>
         <w:sz w:val="20"/>
       </w:rPr>
     </w:lvl>
@@ -14636,7 +14636,7 @@
         <w:ind w:left="5760" w:hanging="360"/>
       </w:pPr>
       <w:rPr>
-        <w:rFonts w:ascii="Wingdings" w:hAnsi="Wingdings" w:hint="default"/>
+        <w:rFonts w:hint="default" w:ascii="Wingdings" w:hAnsi="Wingdings"/>
         <w:sz w:val="20"/>
       </w:rPr>
     </w:lvl>
@@ -14652,7 +14652,7 @@
         <w:ind w:left="6480" w:hanging="360"/>
       </w:pPr>
       <w:rPr>
-        <w:rFonts w:ascii="Wingdings" w:hAnsi="Wingdings" w:hint="default"/>
+        <w:rFonts w:hint="default" w:ascii="Wingdings" w:hAnsi="Wingdings"/>
         <w:sz w:val="20"/>
       </w:rPr>
     </w:lvl>
@@ -14673,7 +14673,7 @@
         <w:ind w:left="720" w:hanging="360"/>
       </w:pPr>
       <w:rPr>
-        <w:rFonts w:ascii="Symbol" w:hAnsi="Symbol" w:hint="default"/>
+        <w:rFonts w:hint="default" w:ascii="Symbol" w:hAnsi="Symbol"/>
         <w:sz w:val="20"/>
       </w:rPr>
     </w:lvl>
@@ -14689,7 +14689,7 @@
         <w:ind w:left="1440" w:hanging="360"/>
       </w:pPr>
       <w:rPr>
-        <w:rFonts w:ascii="Courier New" w:hAnsi="Courier New" w:hint="default"/>
+        <w:rFonts w:hint="default" w:ascii="Courier New" w:hAnsi="Courier New"/>
         <w:sz w:val="20"/>
       </w:rPr>
     </w:lvl>
@@ -14705,7 +14705,7 @@
         <w:ind w:left="2160" w:hanging="360"/>
       </w:pPr>
       <w:rPr>
-        <w:rFonts w:ascii="Wingdings" w:hAnsi="Wingdings" w:hint="default"/>
+        <w:rFonts w:hint="default" w:ascii="Wingdings" w:hAnsi="Wingdings"/>
         <w:sz w:val="20"/>
       </w:rPr>
     </w:lvl>
@@ -14721,7 +14721,7 @@
         <w:ind w:left="2880" w:hanging="360"/>
       </w:pPr>
       <w:rPr>
-        <w:rFonts w:ascii="Wingdings" w:hAnsi="Wingdings" w:hint="default"/>
+        <w:rFonts w:hint="default" w:ascii="Wingdings" w:hAnsi="Wingdings"/>
         <w:sz w:val="20"/>
       </w:rPr>
     </w:lvl>
@@ -14737,7 +14737,7 @@
         <w:ind w:left="3600" w:hanging="360"/>
       </w:pPr>
       <w:rPr>
-        <w:rFonts w:ascii="Wingdings" w:hAnsi="Wingdings" w:hint="default"/>
+        <w:rFonts w:hint="default" w:ascii="Wingdings" w:hAnsi="Wingdings"/>
         <w:sz w:val="20"/>
       </w:rPr>
     </w:lvl>
@@ -14753,7 +14753,7 @@
         <w:ind w:left="4320" w:hanging="360"/>
       </w:pPr>
       <w:rPr>
-        <w:rFonts w:ascii="Wingdings" w:hAnsi="Wingdings" w:hint="default"/>
+        <w:rFonts w:hint="default" w:ascii="Wingdings" w:hAnsi="Wingdings"/>
         <w:sz w:val="20"/>
       </w:rPr>
     </w:lvl>
@@ -14769,7 +14769,7 @@
         <w:ind w:left="5040" w:hanging="360"/>
       </w:pPr>
       <w:rPr>
-        <w:rFonts w:ascii="Wingdings" w:hAnsi="Wingdings" w:hint="default"/>
+        <w:rFonts w:hint="default" w:ascii="Wingdings" w:hAnsi="Wingdings"/>
         <w:sz w:val="20"/>
       </w:rPr>
     </w:lvl>
@@ -14785,7 +14785,7 @@
         <w:ind w:left="5760" w:hanging="360"/>
       </w:pPr>
       <w:rPr>
-        <w:rFonts w:ascii="Wingdings" w:hAnsi="Wingdings" w:hint="default"/>
+        <w:rFonts w:hint="default" w:ascii="Wingdings" w:hAnsi="Wingdings"/>
         <w:sz w:val="20"/>
       </w:rPr>
     </w:lvl>
@@ -14801,7 +14801,7 @@
         <w:ind w:left="6480" w:hanging="360"/>
       </w:pPr>
       <w:rPr>
-        <w:rFonts w:ascii="Wingdings" w:hAnsi="Wingdings" w:hint="default"/>
+        <w:rFonts w:hint="default" w:ascii="Wingdings" w:hAnsi="Wingdings"/>
         <w:sz w:val="20"/>
       </w:rPr>
     </w:lvl>
@@ -14940,7 +14940,7 @@
         <w:ind w:left="720" w:hanging="360"/>
       </w:pPr>
       <w:rPr>
-        <w:rFonts w:ascii="Symbol" w:hAnsi="Symbol" w:hint="default"/>
+        <w:rFonts w:hint="default" w:ascii="Symbol" w:hAnsi="Symbol"/>
         <w:sz w:val="20"/>
       </w:rPr>
     </w:lvl>
@@ -14956,7 +14956,7 @@
         <w:ind w:left="1440" w:hanging="360"/>
       </w:pPr>
       <w:rPr>
-        <w:rFonts w:ascii="Courier New" w:hAnsi="Courier New" w:hint="default"/>
+        <w:rFonts w:hint="default" w:ascii="Courier New" w:hAnsi="Courier New"/>
         <w:sz w:val="20"/>
       </w:rPr>
     </w:lvl>
@@ -14972,7 +14972,7 @@
         <w:ind w:left="2160" w:hanging="360"/>
       </w:pPr>
       <w:rPr>
-        <w:rFonts w:ascii="Wingdings" w:hAnsi="Wingdings" w:hint="default"/>
+        <w:rFonts w:hint="default" w:ascii="Wingdings" w:hAnsi="Wingdings"/>
         <w:sz w:val="20"/>
       </w:rPr>
     </w:lvl>
@@ -14988,7 +14988,7 @@
         <w:ind w:left="2880" w:hanging="360"/>
       </w:pPr>
       <w:rPr>
-        <w:rFonts w:ascii="Wingdings" w:hAnsi="Wingdings" w:hint="default"/>
+        <w:rFonts w:hint="default" w:ascii="Wingdings" w:hAnsi="Wingdings"/>
         <w:sz w:val="20"/>
       </w:rPr>
     </w:lvl>
@@ -15004,7 +15004,7 @@
         <w:ind w:left="3600" w:hanging="360"/>
       </w:pPr>
       <w:rPr>
-        <w:rFonts w:ascii="Wingdings" w:hAnsi="Wingdings" w:hint="default"/>
+        <w:rFonts w:hint="default" w:ascii="Wingdings" w:hAnsi="Wingdings"/>
         <w:sz w:val="20"/>
       </w:rPr>
     </w:lvl>
@@ -15020,7 +15020,7 @@
         <w:ind w:left="4320" w:hanging="360"/>
       </w:pPr>
       <w:rPr>
-        <w:rFonts w:ascii="Wingdings" w:hAnsi="Wingdings" w:hint="default"/>
+        <w:rFonts w:hint="default" w:ascii="Wingdings" w:hAnsi="Wingdings"/>
         <w:sz w:val="20"/>
       </w:rPr>
     </w:lvl>
@@ -15036,7 +15036,7 @@
         <w:ind w:left="5040" w:hanging="360"/>
       </w:pPr>
       <w:rPr>
-        <w:rFonts w:ascii="Wingdings" w:hAnsi="Wingdings" w:hint="default"/>
+        <w:rFonts w:hint="default" w:ascii="Wingdings" w:hAnsi="Wingdings"/>
         <w:sz w:val="20"/>
       </w:rPr>
     </w:lvl>
@@ -15052,7 +15052,7 @@
         <w:ind w:left="5760" w:hanging="360"/>
       </w:pPr>
       <w:rPr>
-        <w:rFonts w:ascii="Wingdings" w:hAnsi="Wingdings" w:hint="default"/>
+        <w:rFonts w:hint="default" w:ascii="Wingdings" w:hAnsi="Wingdings"/>
         <w:sz w:val="20"/>
       </w:rPr>
     </w:lvl>
@@ -15068,7 +15068,7 @@
         <w:ind w:left="6480" w:hanging="360"/>
       </w:pPr>
       <w:rPr>
-        <w:rFonts w:ascii="Wingdings" w:hAnsi="Wingdings" w:hint="default"/>
+        <w:rFonts w:hint="default" w:ascii="Wingdings" w:hAnsi="Wingdings"/>
         <w:sz w:val="20"/>
       </w:rPr>
     </w:lvl>
@@ -15126,7 +15126,7 @@
         <w:ind w:left="2160" w:hanging="360"/>
       </w:pPr>
       <w:rPr>
-        <w:rFonts w:ascii="Wingdings" w:hAnsi="Wingdings" w:hint="default"/>
+        <w:rFonts w:hint="default" w:ascii="Wingdings" w:hAnsi="Wingdings"/>
         <w:sz w:val="20"/>
       </w:rPr>
     </w:lvl>
@@ -15142,7 +15142,7 @@
         <w:ind w:left="2880" w:hanging="360"/>
       </w:pPr>
       <w:rPr>
-        <w:rFonts w:ascii="Wingdings" w:hAnsi="Wingdings" w:hint="default"/>
+        <w:rFonts w:hint="default" w:ascii="Wingdings" w:hAnsi="Wingdings"/>
         <w:sz w:val="20"/>
       </w:rPr>
     </w:lvl>
@@ -15158,7 +15158,7 @@
         <w:ind w:left="3600" w:hanging="360"/>
       </w:pPr>
       <w:rPr>
-        <w:rFonts w:ascii="Wingdings" w:hAnsi="Wingdings" w:hint="default"/>
+        <w:rFonts w:hint="default" w:ascii="Wingdings" w:hAnsi="Wingdings"/>
         <w:sz w:val="20"/>
       </w:rPr>
     </w:lvl>
@@ -15174,7 +15174,7 @@
         <w:ind w:left="4320" w:hanging="360"/>
       </w:pPr>
       <w:rPr>
-        <w:rFonts w:ascii="Wingdings" w:hAnsi="Wingdings" w:hint="default"/>
+        <w:rFonts w:hint="default" w:ascii="Wingdings" w:hAnsi="Wingdings"/>
         <w:sz w:val="20"/>
       </w:rPr>
     </w:lvl>
@@ -15190,7 +15190,7 @@
         <w:ind w:left="5040" w:hanging="360"/>
       </w:pPr>
       <w:rPr>
-        <w:rFonts w:ascii="Wingdings" w:hAnsi="Wingdings" w:hint="default"/>
+        <w:rFonts w:hint="default" w:ascii="Wingdings" w:hAnsi="Wingdings"/>
         <w:sz w:val="20"/>
       </w:rPr>
     </w:lvl>
@@ -15206,7 +15206,7 @@
         <w:ind w:left="5760" w:hanging="360"/>
       </w:pPr>
       <w:rPr>
-        <w:rFonts w:ascii="Wingdings" w:hAnsi="Wingdings" w:hint="default"/>
+        <w:rFonts w:hint="default" w:ascii="Wingdings" w:hAnsi="Wingdings"/>
         <w:sz w:val="20"/>
       </w:rPr>
     </w:lvl>
@@ -15222,7 +15222,7 @@
         <w:ind w:left="6480" w:hanging="360"/>
       </w:pPr>
       <w:rPr>
-        <w:rFonts w:ascii="Wingdings" w:hAnsi="Wingdings" w:hint="default"/>
+        <w:rFonts w:hint="default" w:ascii="Wingdings" w:hAnsi="Wingdings"/>
         <w:sz w:val="20"/>
       </w:rPr>
     </w:lvl>
@@ -15280,7 +15280,7 @@
         <w:ind w:left="2160" w:hanging="360"/>
       </w:pPr>
       <w:rPr>
-        <w:rFonts w:ascii="Wingdings" w:hAnsi="Wingdings" w:hint="default"/>
+        <w:rFonts w:hint="default" w:ascii="Wingdings" w:hAnsi="Wingdings"/>
         <w:sz w:val="20"/>
       </w:rPr>
     </w:lvl>
@@ -15296,7 +15296,7 @@
         <w:ind w:left="2880" w:hanging="360"/>
       </w:pPr>
       <w:rPr>
-        <w:rFonts w:ascii="Wingdings" w:hAnsi="Wingdings" w:hint="default"/>
+        <w:rFonts w:hint="default" w:ascii="Wingdings" w:hAnsi="Wingdings"/>
         <w:sz w:val="20"/>
       </w:rPr>
     </w:lvl>
@@ -15312,7 +15312,7 @@
         <w:ind w:left="3600" w:hanging="360"/>
       </w:pPr>
       <w:rPr>
-        <w:rFonts w:ascii="Wingdings" w:hAnsi="Wingdings" w:hint="default"/>
+        <w:rFonts w:hint="default" w:ascii="Wingdings" w:hAnsi="Wingdings"/>
         <w:sz w:val="20"/>
       </w:rPr>
     </w:lvl>
@@ -15328,7 +15328,7 @@
         <w:ind w:left="4320" w:hanging="360"/>
       </w:pPr>
       <w:rPr>
-        <w:rFonts w:ascii="Wingdings" w:hAnsi="Wingdings" w:hint="default"/>
+        <w:rFonts w:hint="default" w:ascii="Wingdings" w:hAnsi="Wingdings"/>
         <w:sz w:val="20"/>
       </w:rPr>
     </w:lvl>
@@ -15344,7 +15344,7 @@
         <w:ind w:left="5040" w:hanging="360"/>
       </w:pPr>
       <w:rPr>
-        <w:rFonts w:ascii="Wingdings" w:hAnsi="Wingdings" w:hint="default"/>
+        <w:rFonts w:hint="default" w:ascii="Wingdings" w:hAnsi="Wingdings"/>
         <w:sz w:val="20"/>
       </w:rPr>
     </w:lvl>
@@ -15360,7 +15360,7 @@
         <w:ind w:left="5760" w:hanging="360"/>
       </w:pPr>
       <w:rPr>
-        <w:rFonts w:ascii="Wingdings" w:hAnsi="Wingdings" w:hint="default"/>
+        <w:rFonts w:hint="default" w:ascii="Wingdings" w:hAnsi="Wingdings"/>
         <w:sz w:val="20"/>
       </w:rPr>
     </w:lvl>
@@ -15376,7 +15376,7 @@
         <w:ind w:left="6480" w:hanging="360"/>
       </w:pPr>
       <w:rPr>
-        <w:rFonts w:ascii="Wingdings" w:hAnsi="Wingdings" w:hint="default"/>
+        <w:rFonts w:hint="default" w:ascii="Wingdings" w:hAnsi="Wingdings"/>
         <w:sz w:val="20"/>
       </w:rPr>
     </w:lvl>
@@ -15409,7 +15409,7 @@
         <w:ind w:left="1440" w:hanging="360"/>
       </w:pPr>
       <w:rPr>
-        <w:rFonts w:ascii="Courier New" w:hAnsi="Courier New" w:hint="default"/>
+        <w:rFonts w:hint="default" w:ascii="Courier New" w:hAnsi="Courier New"/>
         <w:sz w:val="20"/>
       </w:rPr>
     </w:lvl>
@@ -15603,7 +15603,7 @@
         <w:ind w:left="720" w:hanging="360"/>
       </w:pPr>
       <w:rPr>
-        <w:rFonts w:ascii="Symbol" w:hAnsi="Symbol" w:hint="default"/>
+        <w:rFonts w:hint="default" w:ascii="Symbol" w:hAnsi="Symbol"/>
         <w:sz w:val="20"/>
       </w:rPr>
     </w:lvl>
@@ -15619,7 +15619,7 @@
         <w:ind w:left="1440" w:hanging="360"/>
       </w:pPr>
       <w:rPr>
-        <w:rFonts w:ascii="Courier New" w:hAnsi="Courier New" w:hint="default"/>
+        <w:rFonts w:hint="default" w:ascii="Courier New" w:hAnsi="Courier New"/>
         <w:sz w:val="20"/>
       </w:rPr>
     </w:lvl>
@@ -15635,7 +15635,7 @@
         <w:ind w:left="2160" w:hanging="360"/>
       </w:pPr>
       <w:rPr>
-        <w:rFonts w:ascii="Wingdings" w:hAnsi="Wingdings" w:hint="default"/>
+        <w:rFonts w:hint="default" w:ascii="Wingdings" w:hAnsi="Wingdings"/>
         <w:sz w:val="20"/>
       </w:rPr>
     </w:lvl>
@@ -15651,7 +15651,7 @@
         <w:ind w:left="2880" w:hanging="360"/>
       </w:pPr>
       <w:rPr>
-        <w:rFonts w:ascii="Wingdings" w:hAnsi="Wingdings" w:hint="default"/>
+        <w:rFonts w:hint="default" w:ascii="Wingdings" w:hAnsi="Wingdings"/>
         <w:sz w:val="20"/>
       </w:rPr>
     </w:lvl>
@@ -15667,7 +15667,7 @@
         <w:ind w:left="3600" w:hanging="360"/>
       </w:pPr>
       <w:rPr>
-        <w:rFonts w:ascii="Wingdings" w:hAnsi="Wingdings" w:hint="default"/>
+        <w:rFonts w:hint="default" w:ascii="Wingdings" w:hAnsi="Wingdings"/>
         <w:sz w:val="20"/>
       </w:rPr>
     </w:lvl>
@@ -15683,7 +15683,7 @@
         <w:ind w:left="4320" w:hanging="360"/>
       </w:pPr>
       <w:rPr>
-        <w:rFonts w:ascii="Wingdings" w:hAnsi="Wingdings" w:hint="default"/>
+        <w:rFonts w:hint="default" w:ascii="Wingdings" w:hAnsi="Wingdings"/>
         <w:sz w:val="20"/>
       </w:rPr>
     </w:lvl>
@@ -15699,7 +15699,7 @@
         <w:ind w:left="5040" w:hanging="360"/>
       </w:pPr>
       <w:rPr>
-        <w:rFonts w:ascii="Wingdings" w:hAnsi="Wingdings" w:hint="default"/>
+        <w:rFonts w:hint="default" w:ascii="Wingdings" w:hAnsi="Wingdings"/>
         <w:sz w:val="20"/>
       </w:rPr>
     </w:lvl>
@@ -15715,7 +15715,7 @@
         <w:ind w:left="5760" w:hanging="360"/>
       </w:pPr>
       <w:rPr>
-        <w:rFonts w:ascii="Wingdings" w:hAnsi="Wingdings" w:hint="default"/>
+        <w:rFonts w:hint="default" w:ascii="Wingdings" w:hAnsi="Wingdings"/>
         <w:sz w:val="20"/>
       </w:rPr>
     </w:lvl>
@@ -15731,7 +15731,7 @@
         <w:ind w:left="6480" w:hanging="360"/>
       </w:pPr>
       <w:rPr>
-        <w:rFonts w:ascii="Wingdings" w:hAnsi="Wingdings" w:hint="default"/>
+        <w:rFonts w:hint="default" w:ascii="Wingdings" w:hAnsi="Wingdings"/>
         <w:sz w:val="20"/>
       </w:rPr>
     </w:lvl>
@@ -15789,7 +15789,7 @@
         <w:ind w:left="2160" w:hanging="360"/>
       </w:pPr>
       <w:rPr>
-        <w:rFonts w:ascii="Wingdings" w:hAnsi="Wingdings" w:hint="default"/>
+        <w:rFonts w:hint="default" w:ascii="Wingdings" w:hAnsi="Wingdings"/>
         <w:sz w:val="20"/>
       </w:rPr>
     </w:lvl>
@@ -15805,7 +15805,7 @@
         <w:ind w:left="2880" w:hanging="360"/>
       </w:pPr>
       <w:rPr>
-        <w:rFonts w:ascii="Wingdings" w:hAnsi="Wingdings" w:hint="default"/>
+        <w:rFonts w:hint="default" w:ascii="Wingdings" w:hAnsi="Wingdings"/>
         <w:sz w:val="20"/>
       </w:rPr>
     </w:lvl>
@@ -15821,7 +15821,7 @@
         <w:ind w:left="3600" w:hanging="360"/>
       </w:pPr>
       <w:rPr>
-        <w:rFonts w:ascii="Wingdings" w:hAnsi="Wingdings" w:hint="default"/>
+        <w:rFonts w:hint="default" w:ascii="Wingdings" w:hAnsi="Wingdings"/>
         <w:sz w:val="20"/>
       </w:rPr>
     </w:lvl>
@@ -15837,7 +15837,7 @@
         <w:ind w:left="4320" w:hanging="360"/>
       </w:pPr>
       <w:rPr>
-        <w:rFonts w:ascii="Wingdings" w:hAnsi="Wingdings" w:hint="default"/>
+        <w:rFonts w:hint="default" w:ascii="Wingdings" w:hAnsi="Wingdings"/>
         <w:sz w:val="20"/>
       </w:rPr>
     </w:lvl>
@@ -15853,7 +15853,7 @@
         <w:ind w:left="5040" w:hanging="360"/>
       </w:pPr>
       <w:rPr>
-        <w:rFonts w:ascii="Wingdings" w:hAnsi="Wingdings" w:hint="default"/>
+        <w:rFonts w:hint="default" w:ascii="Wingdings" w:hAnsi="Wingdings"/>
         <w:sz w:val="20"/>
       </w:rPr>
     </w:lvl>
@@ -15869,7 +15869,7 @@
         <w:ind w:left="5760" w:hanging="360"/>
       </w:pPr>
       <w:rPr>
-        <w:rFonts w:ascii="Wingdings" w:hAnsi="Wingdings" w:hint="default"/>
+        <w:rFonts w:hint="default" w:ascii="Wingdings" w:hAnsi="Wingdings"/>
         <w:sz w:val="20"/>
       </w:rPr>
     </w:lvl>
@@ -15885,7 +15885,7 @@
         <w:ind w:left="6480" w:hanging="360"/>
       </w:pPr>
       <w:rPr>
-        <w:rFonts w:ascii="Wingdings" w:hAnsi="Wingdings" w:hint="default"/>
+        <w:rFonts w:hint="default" w:ascii="Wingdings" w:hAnsi="Wingdings"/>
         <w:sz w:val="20"/>
       </w:rPr>
     </w:lvl>

</xml_diff>